<commit_message>
Add TOC to Report 1, embed figures in Report 3, fix British spellings
- Report 1: inserted Word TOC field after cover page (update with F9 in Word)
- Report 3 Section 9: rewrote all output descriptions with technical tone,
  added all 9 figures and 7 table images inline after each explanation
- generate_reports.py: fixed behaviour→behavior, penalises→penalizes,
  normalise→normalize, colour→color, maximises→maximizes throughout
- nbcf_final.py: fixed Normalised→Normalized in two plot titles

Co-Authored-By: Claude Sonnet 4.6 <noreply@anthropic.com>
</commit_message>
<xml_diff>
--- a/report/final/Report_1_Final.docx
+++ b/report/final/Report_1_Final.docx
@@ -99,6 +99,46 @@
           <w:rFonts w:ascii="Times New Roman" w:hAnsi="Times New Roman"/>
           <w:color w:val="1A4F8A"/>
         </w:rPr>
+        <w:t>Table of Contents</w:t>
+      </w:r>
+    </w:p>
+    <w:p>
+      <w:r>
+        <w:fldChar w:fldCharType="begin"/>
+      </w:r>
+      <w:r>
+        <w:instrText xml:space="preserve"> TOC \o "1-3" \h \z \u </w:instrText>
+      </w:r>
+      <w:r>
+        <w:fldChar w:fldCharType="separate"/>
+      </w:r>
+      <w:r>
+        <w:rPr>
+          <w:rFonts w:ascii="Times New Roman" w:hAnsi="Times New Roman"/>
+          <w:i/>
+          <w:sz w:val="20"/>
+        </w:rPr>
+        <w:t>[ Open in Microsoft Word and press Ctrl+A, then F9 to populate page numbers. ]</w:t>
+      </w:r>
+      <w:r>
+        <w:fldChar w:fldCharType="end"/>
+      </w:r>
+    </w:p>
+    <w:p>
+      <w:r>
+        <w:br w:type="page"/>
+      </w:r>
+    </w:p>
+    <w:p>
+      <w:pPr>
+        <w:pStyle w:val="Heading1"/>
+        <w:jc w:val="left"/>
+      </w:pPr>
+      <w:r>
+        <w:rPr>
+          <w:rFonts w:ascii="Times New Roman" w:hAnsi="Times New Roman"/>
+          <w:color w:val="1A4F8A"/>
+        </w:rPr>
         <w:t>Abstract</w:t>
       </w:r>
     </w:p>
@@ -114,7 +154,7 @@
           <w:i w:val="0"/>
           <w:sz w:val="24"/>
         </w:rPr>
-        <w:t>Rating prediction in collaborative filtering (CF) is challenging due to high matrix sparsity and temporal preference drift. This project implements and extends a Naïve Bayes Collaborative Filtering (NBCF) system evaluated on the MovieLens-1M benchmark. The midterm version introduced a hybrid user-based / item-based NBCF with exponential temporal decay weighting and entropy-based confidence scoring. The final version adds three substantial improvements: (1) Top-K neighborhood selection that restricts evidence to the K=30 most similar neighbors ranked by co-rater overlap, (2) RMSE as a complementary evaluation metric alongside MAE, and (3) stratified evaluation across three user activity groups to expose cold-start behaviour. The final model (TopK+Temporal) achieves MAE = 0.798 and RMSE = 1.126 on the held-out test set, with a 59% latency reduction compared to the full-neighbourhood temporal baseline (34.8 ms → 14.3 ms per prediction). Confidence-filtered predictions covering 29.3% of the test set achieve a filtered MAE of 0.706, confirming that the model's uncertainty estimates are informative. An alpha sensitivity analysis shows that the temporal variant is robust to the Laplace smoothing parameter.</w:t>
+        <w:t>Rating prediction in collaborative filtering (CF) is challenging due to high matrix sparsity and temporal preference drift. This project implements and extends a Naïve Bayes Collaborative Filtering (NBCF) system evaluated on the MovieLens-1M benchmark. The midterm version introduced a hybrid user-based / item-based NBCF with exponential temporal decay weighting and entropy-based confidence scoring. The final version adds three substantial improvements: (1) Top-K neighborhood selection that restricts evidence to the K=30 most similar neighbors ranked by co-rater overlap, (2) RMSE as a complementary evaluation metric alongside MAE, and (3) stratified evaluation across three user activity groups to expose cold-start behavior. The final model (TopK+Temporal) achieves MAE = 0.798 and RMSE = 1.126 on the held-out test set, with a 59% latency reduction compared to the full-neighbourhood temporal baseline (34.8 ms → 14.3 ms per prediction). Confidence-filtered predictions covering 29.3% of the test set achieve a filtered MAE of 0.706, confirming that the model's uncertainty estimates are informative. An alpha sensitivity analysis shows that the temporal variant is robust to the Laplace smoothing parameter.</w:t>
       </w:r>
     </w:p>
     <w:p>
@@ -142,7 +182,7 @@
           <w:i w:val="0"/>
           <w:sz w:val="24"/>
         </w:rPr>
-        <w:t>Online platforms such as streaming services and e-commerce sites offer millions of items, making manual discovery infeasible. Recommender systems address this by predicting user preferences from historical behaviour. Collaborative Filtering (CF), the dominant paradigm, assumes that users who agreed in the past will agree again in the future, requiring no item metadata and scaling naturally with usage data.</w:t>
+        <w:t>Online platforms such as streaming services and e-commerce sites offer millions of items, making manual discovery infeasible. Recommender systems address this by predicting user preferences from historical behavior. Collaborative Filtering (CF), the dominant paradigm, assumes that users who agreed in the past will agree again in the future, requiring no item metadata and scaling naturally with usage data.</w:t>
       </w:r>
     </w:p>
     <w:p>
@@ -759,7 +799,7 @@
           <w:i w:val="0"/>
           <w:sz w:val="24"/>
         </w:rPr>
-        <w:t>We find y ∈ {1,2,3,4,5} that maximises the posterior. Under the Naïve Bayes assumption, past ratings are conditionally independent given y. The user-based (UB) variant gives:</w:t>
+        <w:t>We find y ∈ {1,2,3,4,5} that maximizes the posterior. Under the Naïve Bayes assumption, past ratings are conditionally independent given y. The user-based (UB) variant gives:</w:t>
       </w:r>
     </w:p>
     <w:p>
@@ -1539,7 +1579,7 @@
           <w:rFonts w:ascii="Times New Roman" w:hAnsi="Times New Roman"/>
           <w:sz w:val="24"/>
         </w:rPr>
-        <w:t>RMSE — Root Mean Squared Error; penalises large errors more.</w:t>
+        <w:t>RMSE — Root Mean Squared Error; penalizes large errors more.</w:t>
       </w:r>
     </w:p>
     <w:p>
@@ -3491,7 +3531,7 @@
           <w:i w:val="0"/>
           <w:sz w:val="24"/>
         </w:rPr>
-        <w:t>This project demonstrates that NBCF can be extended incrementally while remaining interpretable and training-free. The midterm version established a working hybrid NBCF with temporal decay and confidence scoring. The final version corrects the confidence degeneracy, introduces Top-K neighborhood selection, adds RMSE, and reveals cold-start behaviour through stratified evaluation.</w:t>
+        <w:t>This project demonstrates that NBCF can be extended incrementally while remaining interpretable and training-free. The midterm version established a working hybrid NBCF with temporal decay and confidence scoring. The final version corrects the confidence degeneracy, introduces Top-K neighborhood selection, adds RMSE, and reveals cold-start behavior through stratified evaluation.</w:t>
       </w:r>
     </w:p>
     <w:p>

</xml_diff>

<commit_message>
Replace Word TOC field with manual static table of contents
Dotted-leader tab stops with approximate page numbers —
no Word update required, works on any platform.

Co-Authored-By: Claude Sonnet 4.6 <noreply@anthropic.com>
</commit_message>
<xml_diff>
--- a/report/final/Report_1_Final.docx
+++ b/report/final/Report_1_Final.docx
@@ -103,25 +103,497 @@
       </w:r>
     </w:p>
     <w:p>
-      <w:r>
-        <w:fldChar w:fldCharType="begin"/>
-      </w:r>
-      <w:r>
-        <w:instrText xml:space="preserve"> TOC \o "1-3" \h \z \u </w:instrText>
-      </w:r>
-      <w:r>
-        <w:fldChar w:fldCharType="separate"/>
-      </w:r>
+      <w:pPr>
+        <w:spacing w:after="40" w:before="0"/>
+        <w:ind w:left="0"/>
+        <w:tabs>
+          <w:tab w:val="right" w:leader="dot" w:pos="7920"/>
+        </w:tabs>
+      </w:pPr>
       <w:r>
         <w:rPr>
           <w:rFonts w:ascii="Times New Roman" w:hAnsi="Times New Roman"/>
-          <w:i/>
-          <w:sz w:val="20"/>
+          <w:b/>
+          <w:sz w:val="24"/>
         </w:rPr>
-        <w:t>[ Open in Microsoft Word and press Ctrl+A, then F9 to populate page numbers. ]</w:t>
+        <w:t>Abstract</w:t>
+        <w:tab/>
+        <w:t>3</w:t>
       </w:r>
+    </w:p>
+    <w:p>
+      <w:pPr>
+        <w:spacing w:after="40" w:before="0"/>
+        <w:ind w:left="0"/>
+        <w:tabs>
+          <w:tab w:val="right" w:leader="dot" w:pos="7920"/>
+        </w:tabs>
+      </w:pPr>
       <w:r>
-        <w:fldChar w:fldCharType="end"/>
+        <w:rPr>
+          <w:rFonts w:ascii="Times New Roman" w:hAnsi="Times New Roman"/>
+          <w:b/>
+          <w:sz w:val="24"/>
+        </w:rPr>
+        <w:t>1.  Introduction</w:t>
+        <w:tab/>
+        <w:t>3</w:t>
+      </w:r>
+    </w:p>
+    <w:p>
+      <w:pPr>
+        <w:spacing w:after="40" w:before="0"/>
+        <w:ind w:left="397"/>
+        <w:tabs>
+          <w:tab w:val="right" w:leader="dot" w:pos="7920"/>
+        </w:tabs>
+      </w:pPr>
+      <w:r>
+        <w:rPr>
+          <w:rFonts w:ascii="Times New Roman" w:hAnsi="Times New Roman"/>
+          <w:b w:val="0"/>
+          <w:sz w:val="22"/>
+        </w:rPr>
+        <w:t>1.1  Dataset</w:t>
+        <w:tab/>
+        <w:t>4</w:t>
+      </w:r>
+    </w:p>
+    <w:p>
+      <w:pPr>
+        <w:spacing w:after="40" w:before="0"/>
+        <w:ind w:left="397"/>
+        <w:tabs>
+          <w:tab w:val="right" w:leader="dot" w:pos="7920"/>
+        </w:tabs>
+      </w:pPr>
+      <w:r>
+        <w:rPr>
+          <w:rFonts w:ascii="Times New Roman" w:hAnsi="Times New Roman"/>
+          <w:b w:val="0"/>
+          <w:sz w:val="22"/>
+        </w:rPr>
+        <w:t>1.2  Formal Problem Statement</w:t>
+        <w:tab/>
+        <w:t>5</w:t>
+      </w:r>
+    </w:p>
+    <w:p>
+      <w:pPr>
+        <w:spacing w:after="40" w:before="0"/>
+        <w:ind w:left="397"/>
+        <w:tabs>
+          <w:tab w:val="right" w:leader="dot" w:pos="7920"/>
+        </w:tabs>
+      </w:pPr>
+      <w:r>
+        <w:rPr>
+          <w:rFonts w:ascii="Times New Roman" w:hAnsi="Times New Roman"/>
+          <w:b w:val="0"/>
+          <w:sz w:val="22"/>
+        </w:rPr>
+        <w:t>1.3  Key Challenges</w:t>
+        <w:tab/>
+        <w:t>5</w:t>
+      </w:r>
+    </w:p>
+    <w:p>
+      <w:pPr>
+        <w:spacing w:after="40" w:before="0"/>
+        <w:ind w:left="0"/>
+        <w:tabs>
+          <w:tab w:val="right" w:leader="dot" w:pos="7920"/>
+        </w:tabs>
+      </w:pPr>
+      <w:r>
+        <w:rPr>
+          <w:rFonts w:ascii="Times New Roman" w:hAnsi="Times New Roman"/>
+          <w:b/>
+          <w:sz w:val="24"/>
+        </w:rPr>
+        <w:t>2.  Related Work</w:t>
+        <w:tab/>
+        <w:t>6</w:t>
+      </w:r>
+    </w:p>
+    <w:p>
+      <w:pPr>
+        <w:spacing w:after="40" w:before="0"/>
+        <w:ind w:left="0"/>
+        <w:tabs>
+          <w:tab w:val="right" w:leader="dot" w:pos="7920"/>
+        </w:tabs>
+      </w:pPr>
+      <w:r>
+        <w:rPr>
+          <w:rFonts w:ascii="Times New Roman" w:hAnsi="Times New Roman"/>
+          <w:b/>
+          <w:sz w:val="24"/>
+        </w:rPr>
+        <w:t>3.  Proposed Approach</w:t>
+        <w:tab/>
+        <w:t>7</w:t>
+      </w:r>
+    </w:p>
+    <w:p>
+      <w:pPr>
+        <w:spacing w:after="40" w:before="0"/>
+        <w:ind w:left="397"/>
+        <w:tabs>
+          <w:tab w:val="right" w:leader="dot" w:pos="7920"/>
+        </w:tabs>
+      </w:pPr>
+      <w:r>
+        <w:rPr>
+          <w:rFonts w:ascii="Times New Roman" w:hAnsi="Times New Roman"/>
+          <w:b w:val="0"/>
+          <w:sz w:val="22"/>
+        </w:rPr>
+        <w:t>3.1  Naïve Bayes Collaborative Filtering</w:t>
+        <w:tab/>
+        <w:t>7</w:t>
+      </w:r>
+    </w:p>
+    <w:p>
+      <w:pPr>
+        <w:spacing w:after="40" w:before="0"/>
+        <w:ind w:left="397"/>
+        <w:tabs>
+          <w:tab w:val="right" w:leader="dot" w:pos="7920"/>
+        </w:tabs>
+      </w:pPr>
+      <w:r>
+        <w:rPr>
+          <w:rFonts w:ascii="Times New Roman" w:hAnsi="Times New Roman"/>
+          <w:b w:val="0"/>
+          <w:sz w:val="22"/>
+        </w:rPr>
+        <w:t>3.2  Log-Space Computation</w:t>
+        <w:tab/>
+        <w:t>7</w:t>
+      </w:r>
+    </w:p>
+    <w:p>
+      <w:pPr>
+        <w:spacing w:after="40" w:before="0"/>
+        <w:ind w:left="397"/>
+        <w:tabs>
+          <w:tab w:val="right" w:leader="dot" w:pos="7920"/>
+        </w:tabs>
+      </w:pPr>
+      <w:r>
+        <w:rPr>
+          <w:rFonts w:ascii="Times New Roman" w:hAnsi="Times New Roman"/>
+          <w:b w:val="0"/>
+          <w:sz w:val="22"/>
+        </w:rPr>
+        <w:t>3.3  Temporal Decay Weighting</w:t>
+        <w:tab/>
+        <w:t>8</w:t>
+      </w:r>
+    </w:p>
+    <w:p>
+      <w:pPr>
+        <w:spacing w:after="40" w:before="0"/>
+        <w:ind w:left="397"/>
+        <w:tabs>
+          <w:tab w:val="right" w:leader="dot" w:pos="7920"/>
+        </w:tabs>
+      </w:pPr>
+      <w:r>
+        <w:rPr>
+          <w:rFonts w:ascii="Times New Roman" w:hAnsi="Times New Roman"/>
+          <w:b w:val="0"/>
+          <w:sz w:val="22"/>
+        </w:rPr>
+        <w:t>3.4  Top-K Neighborhood Selection</w:t>
+        <w:tab/>
+        <w:t>8</w:t>
+      </w:r>
+    </w:p>
+    <w:p>
+      <w:pPr>
+        <w:spacing w:after="40" w:before="0"/>
+        <w:ind w:left="397"/>
+        <w:tabs>
+          <w:tab w:val="right" w:leader="dot" w:pos="7920"/>
+        </w:tabs>
+      </w:pPr>
+      <w:r>
+        <w:rPr>
+          <w:rFonts w:ascii="Times New Roman" w:hAnsi="Times New Roman"/>
+          <w:b w:val="0"/>
+          <w:sz w:val="22"/>
+        </w:rPr>
+        <w:t>3.5  Hybrid Combination</w:t>
+        <w:tab/>
+        <w:t>9</w:t>
+      </w:r>
+    </w:p>
+    <w:p>
+      <w:pPr>
+        <w:spacing w:after="40" w:before="0"/>
+        <w:ind w:left="397"/>
+        <w:tabs>
+          <w:tab w:val="right" w:leader="dot" w:pos="7920"/>
+        </w:tabs>
+      </w:pPr>
+      <w:r>
+        <w:rPr>
+          <w:rFonts w:ascii="Times New Roman" w:hAnsi="Times New Roman"/>
+          <w:b w:val="0"/>
+          <w:sz w:val="22"/>
+        </w:rPr>
+        <w:t>3.6  Confidence Scoring</w:t>
+        <w:tab/>
+        <w:t>10</w:t>
+      </w:r>
+    </w:p>
+    <w:p>
+      <w:pPr>
+        <w:spacing w:after="40" w:before="0"/>
+        <w:ind w:left="0"/>
+        <w:tabs>
+          <w:tab w:val="right" w:leader="dot" w:pos="7920"/>
+        </w:tabs>
+      </w:pPr>
+      <w:r>
+        <w:rPr>
+          <w:rFonts w:ascii="Times New Roman" w:hAnsi="Times New Roman"/>
+          <w:b/>
+          <w:sz w:val="24"/>
+        </w:rPr>
+        <w:t>4.  Experimental Setup</w:t>
+        <w:tab/>
+        <w:t>10</w:t>
+      </w:r>
+    </w:p>
+    <w:p>
+      <w:pPr>
+        <w:spacing w:after="40" w:before="0"/>
+        <w:ind w:left="397"/>
+        <w:tabs>
+          <w:tab w:val="right" w:leader="dot" w:pos="7920"/>
+        </w:tabs>
+      </w:pPr>
+      <w:r>
+        <w:rPr>
+          <w:rFonts w:ascii="Times New Roman" w:hAnsi="Times New Roman"/>
+          <w:b w:val="0"/>
+          <w:sz w:val="22"/>
+        </w:rPr>
+        <w:t>4.1  Train / Test Split</w:t>
+        <w:tab/>
+        <w:t>10</w:t>
+      </w:r>
+    </w:p>
+    <w:p>
+      <w:pPr>
+        <w:spacing w:after="40" w:before="0"/>
+        <w:ind w:left="397"/>
+        <w:tabs>
+          <w:tab w:val="right" w:leader="dot" w:pos="7920"/>
+        </w:tabs>
+      </w:pPr>
+      <w:r>
+        <w:rPr>
+          <w:rFonts w:ascii="Times New Roman" w:hAnsi="Times New Roman"/>
+          <w:b w:val="0"/>
+          <w:sz w:val="22"/>
+        </w:rPr>
+        <w:t>4.2  Evaluation Subsets</w:t>
+        <w:tab/>
+        <w:t>10</w:t>
+      </w:r>
+    </w:p>
+    <w:p>
+      <w:pPr>
+        <w:spacing w:after="40" w:before="0"/>
+        <w:ind w:left="397"/>
+        <w:tabs>
+          <w:tab w:val="right" w:leader="dot" w:pos="7920"/>
+        </w:tabs>
+      </w:pPr>
+      <w:r>
+        <w:rPr>
+          <w:rFonts w:ascii="Times New Roman" w:hAnsi="Times New Roman"/>
+          <w:b w:val="0"/>
+          <w:sz w:val="22"/>
+        </w:rPr>
+        <w:t>4.3  Hyperparameters</w:t>
+        <w:tab/>
+        <w:t>11</w:t>
+      </w:r>
+    </w:p>
+    <w:p>
+      <w:pPr>
+        <w:spacing w:after="40" w:before="0"/>
+        <w:ind w:left="397"/>
+        <w:tabs>
+          <w:tab w:val="right" w:leader="dot" w:pos="7920"/>
+        </w:tabs>
+      </w:pPr>
+      <w:r>
+        <w:rPr>
+          <w:rFonts w:ascii="Times New Roman" w:hAnsi="Times New Roman"/>
+          <w:b w:val="0"/>
+          <w:sz w:val="22"/>
+        </w:rPr>
+        <w:t>4.4  Evaluation Metrics</w:t>
+        <w:tab/>
+        <w:t>11</w:t>
+      </w:r>
+    </w:p>
+    <w:p>
+      <w:pPr>
+        <w:spacing w:after="40" w:before="0"/>
+        <w:ind w:left="0"/>
+        <w:tabs>
+          <w:tab w:val="right" w:leader="dot" w:pos="7920"/>
+        </w:tabs>
+      </w:pPr>
+      <w:r>
+        <w:rPr>
+          <w:rFonts w:ascii="Times New Roman" w:hAnsi="Times New Roman"/>
+          <w:b/>
+          <w:sz w:val="24"/>
+        </w:rPr>
+        <w:t>5.  Performance Analysis</w:t>
+        <w:tab/>
+        <w:t>12</w:t>
+      </w:r>
+    </w:p>
+    <w:p>
+      <w:pPr>
+        <w:spacing w:after="40" w:before="0"/>
+        <w:ind w:left="397"/>
+        <w:tabs>
+          <w:tab w:val="right" w:leader="dot" w:pos="7920"/>
+        </w:tabs>
+      </w:pPr>
+      <w:r>
+        <w:rPr>
+          <w:rFonts w:ascii="Times New Roman" w:hAnsi="Times New Roman"/>
+          <w:b w:val="0"/>
+          <w:sz w:val="22"/>
+        </w:rPr>
+        <w:t>5.1  Overall Results</w:t>
+        <w:tab/>
+        <w:t>12</w:t>
+      </w:r>
+    </w:p>
+    <w:p>
+      <w:pPr>
+        <w:spacing w:after="40" w:before="0"/>
+        <w:ind w:left="397"/>
+        <w:tabs>
+          <w:tab w:val="right" w:leader="dot" w:pos="7920"/>
+        </w:tabs>
+      </w:pPr>
+      <w:r>
+        <w:rPr>
+          <w:rFonts w:ascii="Times New Roman" w:hAnsi="Times New Roman"/>
+          <w:b w:val="0"/>
+          <w:sz w:val="22"/>
+        </w:rPr>
+        <w:t>5.2  User Activity Group Analysis</w:t>
+        <w:tab/>
+        <w:t>14</w:t>
+      </w:r>
+    </w:p>
+    <w:p>
+      <w:pPr>
+        <w:spacing w:after="40" w:before="0"/>
+        <w:ind w:left="397"/>
+        <w:tabs>
+          <w:tab w:val="right" w:leader="dot" w:pos="7920"/>
+        </w:tabs>
+      </w:pPr>
+      <w:r>
+        <w:rPr>
+          <w:rFonts w:ascii="Times New Roman" w:hAnsi="Times New Roman"/>
+          <w:b w:val="0"/>
+          <w:sz w:val="22"/>
+        </w:rPr>
+        <w:t>5.3  Confidence Analysis</w:t>
+        <w:tab/>
+        <w:t>16</w:t>
+      </w:r>
+    </w:p>
+    <w:p>
+      <w:pPr>
+        <w:spacing w:after="40" w:before="0"/>
+        <w:ind w:left="397"/>
+        <w:tabs>
+          <w:tab w:val="right" w:leader="dot" w:pos="7920"/>
+        </w:tabs>
+      </w:pPr>
+      <w:r>
+        <w:rPr>
+          <w:rFonts w:ascii="Times New Roman" w:hAnsi="Times New Roman"/>
+          <w:b w:val="0"/>
+          <w:sz w:val="22"/>
+        </w:rPr>
+        <w:t>5.4  Alpha Sensitivity</w:t>
+        <w:tab/>
+        <w:t>17</w:t>
+      </w:r>
+    </w:p>
+    <w:p>
+      <w:pPr>
+        <w:spacing w:after="40" w:before="0"/>
+        <w:ind w:left="397"/>
+        <w:tabs>
+          <w:tab w:val="right" w:leader="dot" w:pos="7920"/>
+        </w:tabs>
+      </w:pPr>
+      <w:r>
+        <w:rPr>
+          <w:rFonts w:ascii="Times New Roman" w:hAnsi="Times New Roman"/>
+          <w:b w:val="0"/>
+          <w:sz w:val="22"/>
+        </w:rPr>
+        <w:t>5.5  Latency and Efficiency</w:t>
+        <w:tab/>
+        <w:t>18</w:t>
+      </w:r>
+    </w:p>
+    <w:p>
+      <w:pPr>
+        <w:spacing w:after="40" w:before="0"/>
+        <w:ind w:left="0"/>
+        <w:tabs>
+          <w:tab w:val="right" w:leader="dot" w:pos="7920"/>
+        </w:tabs>
+      </w:pPr>
+      <w:r>
+        <w:rPr>
+          <w:rFonts w:ascii="Times New Roman" w:hAnsi="Times New Roman"/>
+          <w:b/>
+          <w:sz w:val="24"/>
+        </w:rPr>
+        <w:t>6.  Conclusion</w:t>
+        <w:tab/>
+        <w:t>20</w:t>
+      </w:r>
+    </w:p>
+    <w:p>
+      <w:pPr>
+        <w:spacing w:after="40" w:before="0"/>
+        <w:ind w:left="0"/>
+        <w:tabs>
+          <w:tab w:val="right" w:leader="dot" w:pos="7920"/>
+        </w:tabs>
+      </w:pPr>
+      <w:r>
+        <w:rPr>
+          <w:rFonts w:ascii="Times New Roman" w:hAnsi="Times New Roman"/>
+          <w:b/>
+          <w:sz w:val="24"/>
+        </w:rPr>
+        <w:t>References</w:t>
+        <w:tab/>
+        <w:t>21</w:t>
       </w:r>
     </w:p>
     <w:p>

</xml_diff>